<commit_message>
Final report with measured results; correct the bandwidth claim
- docs/report: report updated with the RTX 3050 / i5-13500H results
  (Table IV, Figs. 3-6, analysis, abstract, conclusion), all equations as
  native Word equations; raw bench.json and the four charts committed
  under docs/report/results/ so every number in the report is traceable.
- Correction to 5ceb2b8: the driver's 112 GB/s was probably not wrong.
  The measured device-to-device copy reaches 102.8 GB/s, 92% of 112 (a
  typical copy efficiency), so this board's memory is likely narrower
  than the model's common configuration. Comments and docs now say the
  driver figure describes the board and the measured copy is the
  reference, instead of calling it a 2x error.
- README: "Verified so far" now reports the real GPU results.

Co-Authored-By: Claude Opus 5.5 <noreply@anthropic.com>
Claude-Session: https://claude.ai/code/session_01HmGNxw4T1MRkmyChP3d8x3
</commit_message>
<xml_diff>
--- a/docs/report/Gas_Leak_PCAP_IEEE_Report.docx
+++ b/docs/report/Gas_Leak_PCAP_IEEE_Report.docx
@@ -58,7 +58,7 @@
         <w:t xml:space="preserve">Abstract</w:t>
       </w:r>
       <w:r>
-        <w:t xml:space="preserve"> — After a toxic gas release, emergency responders need to know which areas will exceed safe exposure limits before the gas reaches them. This paper presents a simulator that solves the two-dimensional advection–diffusion equation with a 5-point stencil and parallelises it in six versions: serial C, OpenMP, MPI with a two-dimensional block decomposition and optional overlap of communication with computation, and three CUDA kernels (naive, shared-memory tiled, and thread-coarsened). We show that the stability limit of the explicit scheme makes iterations per second a misleading target. At 1 m resolution, 49 steps are needed per simulated second, so we measure the real-time factor instead. A roofline analysis shows the stencil is memory-bound at an arithmetic intensity of 1.1 flop/byte. Every parallel version reproduces the serial result bit for bit, verified for OpenMP, MPI on 1–4 ranks, and the CUDA kernels under a CPU emulator of the CUDA execution model. The scheme matches an analytic solution to 0.01% for pure diffusion and converges at first order with wind. A three-dimensional extension couples a Lattice Boltzmann air-flow model to gas transport over real terrain to replay the 2020 Visakhapatnam styrene leak, and a web dashboard lets users place a leak and change the wind interactively.</w:t>
+        <w:t xml:space="preserve"> — After a toxic gas release, emergency responders need to know which areas will exceed safe exposure limits before the gas reaches them. This paper presents a simulator that solves the two-dimensional advection–diffusion equation with a 5-point stencil and parallelises it in six versions: serial C, OpenMP, MPI with a two-dimensional block decomposition and optional overlap of communication with computation, and three CUDA kernels (naive, shared-memory tiled, and thread-coarsened). We show that the stability limit of the explicit scheme makes iterations per second a misleading target. At 1 m resolution, 49 steps are needed per simulated second, so we measure the real-time factor instead. A roofline analysis shows the stencil is memory-bound at an arithmetic intensity of 1.1 flop/byte. Every parallel version reproduces the serial result bit for bit, verified for OpenMP, MPI on 1–4 ranks, and the CUDA kernels under a CPU emulator of the CUDA execution model; on the GPU itself the kernels agree to within 10⁻⁴ of the peak concentration. On an Intel Core i5-13500H with an NVIDIA RTX 3050 laptop GPU, the CUDA kernels run at the laptop's measured memory-bandwidth limit, 21.8× faster than serial C and 16.8× faster than real time on the 4000 × 4000 grid, and 63× faster than real time at 2048 × 2048. The scheme matches an analytic solution to 0.01% for pure diffusion and converges at first order with wind. A three-dimensional extension couples a Lattice Boltzmann air-flow model to gas transport over real terrain to replay the 2020 Visakhapatnam styrene leak, and a web dashboard lets users place a leak and change the wind interactively.</w:t>
       </w:r>
     </w:p>
     <w:p>
@@ -2552,7 +2552,7 @@
     <w:p>
       <w:pPr/>
       <w:r>
-        <w:t xml:space="preserve">All parallel versions reproduce the serial result exactly, and the serial result matches the analytic solution. Verification runs in an automated suite of 45 tests: 40 run on any machine and 5 require an NVIDIA GPU.</w:t>
+        <w:t xml:space="preserve">All parallel versions reproduce the serial result exactly, and the serial result matches the analytic solution. Verification runs in an automated suite of 45 tests: 40 run on any machine and 5 require an NVIDIA GPU. All 45 pass on the test system described in Section VIII-C.</w:t>
       </w:r>
     </w:p>
     <w:p>
@@ -2610,9 +2610,9 @@
         <w:tblLook w:val="04A0" w:firstRow="1" w:lastRow="0" w:firstColumn="0" w:lastColumn="0" w:noHBand="0" w:noVBand="1"/>
       </w:tblPr>
       <w:tblGrid>
-        <w:gridCol w:w="3132"/>
-        <w:gridCol w:w="3426"/>
-        <w:gridCol w:w="2802"/>
+        <w:gridCol w:w="3443"/>
+        <w:gridCol w:w="3229"/>
+        <w:gridCol w:w="2687"/>
       </w:tblGrid>
       <w:tr>
         <w:trPr>
@@ -2620,7 +2620,7 @@
         </w:trPr>
         <w:tc>
           <w:tcPr>
-            <w:tcW w:w="3132" w:type="dxa"/>
+            <w:tcW w:w="3443" w:type="dxa"/>
             <w:shd w:val="clear" w:color="auto" w:fill="F2F2F2"/>
           </w:tcPr>
           <w:p>
@@ -2632,7 +2632,7 @@
         </w:tc>
         <w:tc>
           <w:tcPr>
-            <w:tcW w:w="3426" w:type="dxa"/>
+            <w:tcW w:w="3229" w:type="dxa"/>
             <w:shd w:val="clear" w:color="auto" w:fill="F2F2F2"/>
           </w:tcPr>
           <w:p>
@@ -2644,7 +2644,7 @@
         </w:tc>
         <w:tc>
           <w:tcPr>
-            <w:tcW w:w="2802" w:type="dxa"/>
+            <w:tcW w:w="2687" w:type="dxa"/>
             <w:shd w:val="clear" w:color="auto" w:fill="F2F2F2"/>
           </w:tcPr>
           <w:p>
@@ -2658,7 +2658,7 @@
       <w:tr>
         <w:tc>
           <w:tcPr>
-            <w:tcW w:w="3132" w:type="dxa"/>
+            <w:tcW w:w="3443" w:type="dxa"/>
           </w:tcPr>
           <w:p>
             <w:pPr/>
@@ -2669,7 +2669,7 @@
         </w:tc>
         <w:tc>
           <w:tcPr>
-            <w:tcW w:w="3426" w:type="dxa"/>
+            <w:tcW w:w="3229" w:type="dxa"/>
           </w:tcPr>
           <w:p>
             <w:pPr/>
@@ -2680,7 +2680,7 @@
         </w:tc>
         <w:tc>
           <w:tcPr>
-            <w:tcW w:w="2802" w:type="dxa"/>
+            <w:tcW w:w="2687" w:type="dxa"/>
           </w:tcPr>
           <w:p>
             <w:pPr/>
@@ -2693,7 +2693,7 @@
       <w:tr>
         <w:tc>
           <w:tcPr>
-            <w:tcW w:w="3132" w:type="dxa"/>
+            <w:tcW w:w="3443" w:type="dxa"/>
           </w:tcPr>
           <w:p>
             <w:pPr/>
@@ -2704,7 +2704,7 @@
         </w:tc>
         <w:tc>
           <w:tcPr>
-            <w:tcW w:w="3426" w:type="dxa"/>
+            <w:tcW w:w="3229" w:type="dxa"/>
           </w:tcPr>
           <w:p>
             <w:pPr/>
@@ -2715,7 +2715,7 @@
         </w:tc>
         <w:tc>
           <w:tcPr>
-            <w:tcW w:w="2802" w:type="dxa"/>
+            <w:tcW w:w="2687" w:type="dxa"/>
           </w:tcPr>
           <w:p>
             <w:pPr/>
@@ -2728,7 +2728,7 @@
       <w:tr>
         <w:tc>
           <w:tcPr>
-            <w:tcW w:w="3132" w:type="dxa"/>
+            <w:tcW w:w="3443" w:type="dxa"/>
           </w:tcPr>
           <w:p>
             <w:pPr/>
@@ -2739,7 +2739,7 @@
         </w:tc>
         <w:tc>
           <w:tcPr>
-            <w:tcW w:w="3426" w:type="dxa"/>
+            <w:tcW w:w="3229" w:type="dxa"/>
           </w:tcPr>
           <w:p>
             <w:pPr/>
@@ -2750,7 +2750,7 @@
         </w:tc>
         <w:tc>
           <w:tcPr>
-            <w:tcW w:w="2802" w:type="dxa"/>
+            <w:tcW w:w="2687" w:type="dxa"/>
           </w:tcPr>
           <w:p>
             <w:pPr/>
@@ -2763,7 +2763,7 @@
       <w:tr>
         <w:tc>
           <w:tcPr>
-            <w:tcW w:w="3132" w:type="dxa"/>
+            <w:tcW w:w="3443" w:type="dxa"/>
           </w:tcPr>
           <w:p>
             <w:pPr/>
@@ -2774,7 +2774,7 @@
         </w:tc>
         <w:tc>
           <w:tcPr>
-            <w:tcW w:w="3426" w:type="dxa"/>
+            <w:tcW w:w="3229" w:type="dxa"/>
           </w:tcPr>
           <w:p>
             <w:pPr/>
@@ -2785,7 +2785,7 @@
         </w:tc>
         <w:tc>
           <w:tcPr>
-            <w:tcW w:w="2802" w:type="dxa"/>
+            <w:tcW w:w="2687" w:type="dxa"/>
           </w:tcPr>
           <w:p>
             <w:pPr/>
@@ -2798,37 +2798,34 @@
       <w:tr>
         <w:tc>
           <w:tcPr>
-            <w:tcW w:w="3132" w:type="dxa"/>
-          </w:tcPr>
-          <w:p>
-            <w:pPr/>
-            <w:r>
-              <w:t xml:space="preserve">CUDA kernels on a GPU</w:t>
-            </w:r>
-          </w:p>
-        </w:tc>
-        <w:tc>
-          <w:tcPr>
-            <w:tcW w:w="3426" w:type="dxa"/>
-          </w:tcPr>
-          <w:p>
-            <w:pPr/>
-            <w:r>
-              <w:t xml:space="preserve">1000 × 700, 400 steps</w:t>
-            </w:r>
-          </w:p>
-        </w:tc>
-        <w:tc>
-          <w:tcPr>
-            <w:tcW w:w="2802" w:type="dxa"/>
-          </w:tcPr>
-          <w:p>
-            <w:pPr/>
-            <w:r>
-              <w:rPr>
-                <w:i/>
-              </w:rPr>
-              <w:t xml:space="preserve">Pending: tolerance 10⁻⁴ of peak, as the GPU may fuse multiply–adds</w:t>
+            <w:tcW w:w="3443" w:type="dxa"/>
+          </w:tcPr>
+          <w:p>
+            <w:pPr/>
+            <w:r>
+              <w:t xml:space="preserve">CUDA kernels on the GPU (naive, tiled, coarsened)</w:t>
+            </w:r>
+          </w:p>
+        </w:tc>
+        <w:tc>
+          <w:tcPr>
+            <w:tcW w:w="3229" w:type="dxa"/>
+          </w:tcPr>
+          <w:p>
+            <w:pPr/>
+            <w:r>
+              <w:t xml:space="preserve">1000 × 700, 400 steps, RTX 3050</w:t>
+            </w:r>
+          </w:p>
+        </w:tc>
+        <w:tc>
+          <w:tcPr>
+            <w:tcW w:w="2687" w:type="dxa"/>
+          </w:tcPr>
+          <w:p>
+            <w:pPr/>
+            <w:r>
+              <w:t xml:space="preserve">Within 10⁻⁴ of peak (fused multiply–add rounding)</w:t>
             </w:r>
           </w:p>
         </w:tc>
@@ -2836,34 +2833,34 @@
       <w:tr>
         <w:tc>
           <w:tcPr>
-            <w:tcW w:w="3132" w:type="dxa"/>
-          </w:tcPr>
-          <w:p>
-            <w:pPr/>
-            <w:r>
-              <w:t xml:space="preserve">3D simulator, MPI</w:t>
-            </w:r>
-          </w:p>
-        </w:tc>
-        <w:tc>
-          <w:tcPr>
-            <w:tcW w:w="3426" w:type="dxa"/>
-          </w:tcPr>
-          <w:p>
-            <w:pPr/>
-            <w:r>
-              <w:t xml:space="preserve">1, 2, 4 ranks (CPU build)</w:t>
-            </w:r>
-          </w:p>
-        </w:tc>
-        <w:tc>
-          <w:tcPr>
-            <w:tcW w:w="2802" w:type="dxa"/>
-          </w:tcPr>
-          <w:p>
-            <w:pPr/>
-            <w:r>
-              <w:t xml:space="preserve">Matches single process</w:t>
+            <w:tcW w:w="3443" w:type="dxa"/>
+          </w:tcPr>
+          <w:p>
+            <w:pPr/>
+            <w:r>
+              <w:t xml:space="preserve">Dashboard library, GPU versus CPU build</w:t>
+            </w:r>
+          </w:p>
+        </w:tc>
+        <w:tc>
+          <w:tcPr>
+            <w:tcW w:w="3229" w:type="dxa"/>
+          </w:tcPr>
+          <w:p>
+            <w:pPr/>
+            <w:r>
+              <w:t xml:space="preserve">640 × 480, 300 steps</w:t>
+            </w:r>
+          </w:p>
+        </w:tc>
+        <w:tc>
+          <w:tcPr>
+            <w:tcW w:w="2687" w:type="dxa"/>
+          </w:tcPr>
+          <w:p>
+            <w:pPr/>
+            <w:r>
+              <w:t xml:space="preserve">Within 10⁻⁴ of peak</w:t>
             </w:r>
           </w:p>
         </w:tc>
@@ -2871,7 +2868,42 @@
       <w:tr>
         <w:tc>
           <w:tcPr>
-            <w:tcW w:w="3132" w:type="dxa"/>
+            <w:tcW w:w="3443" w:type="dxa"/>
+          </w:tcPr>
+          <w:p>
+            <w:pPr/>
+            <w:r>
+              <w:t xml:space="preserve">3D simulator, MPI</w:t>
+            </w:r>
+          </w:p>
+        </w:tc>
+        <w:tc>
+          <w:tcPr>
+            <w:tcW w:w="3229" w:type="dxa"/>
+          </w:tcPr>
+          <w:p>
+            <w:pPr/>
+            <w:r>
+              <w:t xml:space="preserve">1, 2, 4 ranks (CPU build)</w:t>
+            </w:r>
+          </w:p>
+        </w:tc>
+        <w:tc>
+          <w:tcPr>
+            <w:tcW w:w="2687" w:type="dxa"/>
+          </w:tcPr>
+          <w:p>
+            <w:pPr/>
+            <w:r>
+              <w:t xml:space="preserve">Matches single process</w:t>
+            </w:r>
+          </w:p>
+        </w:tc>
+      </w:tr>
+      <w:tr>
+        <w:tc>
+          <w:tcPr>
+            <w:tcW w:w="3443" w:type="dxa"/>
           </w:tcPr>
           <w:p>
             <w:pPr/>
@@ -2882,7 +2914,7 @@
         </w:tc>
         <w:tc>
           <w:tcPr>
-            <w:tcW w:w="3426" w:type="dxa"/>
+            <w:tcW w:w="3229" w:type="dxa"/>
           </w:tcPr>
           <w:p>
             <w:pPr/>
@@ -2893,15 +2925,12 @@
         </w:tc>
         <w:tc>
           <w:tcPr>
-            <w:tcW w:w="2802" w:type="dxa"/>
-          </w:tcPr>
-          <w:p>
-            <w:pPr/>
-            <w:r>
-              <w:rPr>
-                <w:i/>
-              </w:rPr>
-              <w:t xml:space="preserve">Pending GPU run</w:t>
+            <w:tcW w:w="2687" w:type="dxa"/>
+          </w:tcPr>
+          <w:p>
+            <w:pPr/>
+            <w:r>
+              <w:t xml:space="preserve">Gas within 1% of peak, wind within 10⁻³</w:t>
             </w:r>
           </w:p>
         </w:tc>
@@ -3352,23 +3381,7 @@
     <w:p>
       <w:pPr/>
       <w:r>
-        <w:rPr>
-          <w:i/>
-        </w:rPr>
-        <w:t xml:space="preserve">Pending: GPU timings require a run of </w:t>
-      </w:r>
-      <w:r>
-        <w:rPr>
-          <w:rStyle w:val="CodeChar"/>
-          <w:i/>
-        </w:rPr>
-        <w:t xml:space="preserve">make report</w:t>
-      </w:r>
-      <w:r>
-        <w:rPr>
-          <w:i/>
-        </w:rPr>
-        <w:t xml:space="preserve"> on a machine with an NVIDIA GPU. Do not cite numbers in this section until that run is complete.</w:t>
+        <w:t xml:space="preserve">All measurements were taken on one laptop: an Intel Core i5-13500H (12 cores, of which 4 are performance and 8 efficiency cores; 16 hardware threads) and an NVIDIA GeForce RTX 3050 4 GB Laptop GPU (driver 566.07, 40 W power limit), running Ubuntu 24.04 under WSL2 with CUDA 12.6. CPU versions ran 20 time steps and GPU versions 500, after a 5-step GPU warm-up. Effective bandwidth assumes the minimum traffic of 8 bytes per cell (Section VII). We ran the full benchmark twice. GPU timings agreed to within 0.1%, but CPU timings varied by up to 30% between runs (serial 23.9 versus 26.6 ms per step, OpenMP 11.9 versus 15.4 ms), because laptop CPUs change clock speed with temperature and background load. Table IV and Figs. 3–6 use the second run, which also measured the bandwidth ceiling.</w:t>
       </w:r>
     </w:p>
     <w:p>
@@ -3388,13 +3401,14 @@
         <w:tblLook w:val="04A0" w:firstRow="1" w:lastRow="0" w:firstColumn="0" w:lastColumn="0" w:noHBand="0" w:noVBand="1"/>
       </w:tblPr>
       <w:tblGrid>
-        <w:gridCol w:w="1974"/>
-        <w:gridCol w:w="1856"/>
-        <w:gridCol w:w="825"/>
-        <w:gridCol w:w="1266"/>
-        <w:gridCol w:w="1312"/>
-        <w:gridCol w:w="968"/>
-        <w:gridCol w:w="1158"/>
+        <w:gridCol w:w="1680"/>
+        <w:gridCol w:w="1417"/>
+        <w:gridCol w:w="998"/>
+        <w:gridCol w:w="1170"/>
+        <w:gridCol w:w="1180"/>
+        <w:gridCol w:w="949"/>
+        <w:gridCol w:w="977"/>
+        <w:gridCol w:w="989"/>
       </w:tblGrid>
       <w:tr>
         <w:trPr>
@@ -3402,7 +3416,7 @@
         </w:trPr>
         <w:tc>
           <w:tcPr>
-            <w:tcW w:w="1974" w:type="dxa"/>
+            <w:tcW w:w="1680" w:type="dxa"/>
             <w:shd w:val="clear" w:color="auto" w:fill="F2F2F2"/>
           </w:tcPr>
           <w:p>
@@ -3414,19 +3428,19 @@
         </w:tc>
         <w:tc>
           <w:tcPr>
-            <w:tcW w:w="1856" w:type="dxa"/>
+            <w:tcW w:w="1417" w:type="dxa"/>
             <w:shd w:val="clear" w:color="auto" w:fill="F2F2F2"/>
           </w:tcPr>
           <w:p>
             <w:pPr/>
             <w:r>
-              <w:t xml:space="preserve">Hardware</w:t>
-            </w:r>
-          </w:p>
-        </w:tc>
-        <w:tc>
-          <w:tcPr>
-            <w:tcW w:w="825" w:type="dxa"/>
+              <w:t xml:space="preserve">Parallelism</w:t>
+            </w:r>
+          </w:p>
+        </w:tc>
+        <w:tc>
+          <w:tcPr>
+            <w:tcW w:w="998" w:type="dxa"/>
             <w:shd w:val="clear" w:color="auto" w:fill="F2F2F2"/>
           </w:tcPr>
           <w:p>
@@ -3438,43 +3452,55 @@
         </w:tc>
         <w:tc>
           <w:tcPr>
-            <w:tcW w:w="1266" w:type="dxa"/>
+            <w:tcW w:w="1170" w:type="dxa"/>
             <w:shd w:val="clear" w:color="auto" w:fill="F2F2F2"/>
           </w:tcPr>
           <w:p>
             <w:pPr/>
             <w:r>
-              <w:t xml:space="preserve">Cell updates/s</w:t>
-            </w:r>
-          </w:p>
-        </w:tc>
-        <w:tc>
-          <w:tcPr>
-            <w:tcW w:w="1312" w:type="dxa"/>
+              <w:t xml:space="preserve">Cell updates/s (10⁹)</w:t>
+            </w:r>
+          </w:p>
+        </w:tc>
+        <w:tc>
+          <w:tcPr>
+            <w:tcW w:w="1180" w:type="dxa"/>
             <w:shd w:val="clear" w:color="auto" w:fill="F2F2F2"/>
           </w:tcPr>
           <w:p>
             <w:pPr/>
             <w:r>
-              <w:t xml:space="preserve">% of peak bandwidth</w:t>
-            </w:r>
-          </w:p>
-        </w:tc>
-        <w:tc>
-          <w:tcPr>
-            <w:tcW w:w="968" w:type="dxa"/>
+              <w:t xml:space="preserve">Effective bandwidth (GB/s)</w:t>
+            </w:r>
+          </w:p>
+        </w:tc>
+        <w:tc>
+          <w:tcPr>
+            <w:tcW w:w="949" w:type="dxa"/>
             <w:shd w:val="clear" w:color="auto" w:fill="F2F2F2"/>
           </w:tcPr>
           <w:p>
             <w:pPr/>
             <w:r>
+              <w:t xml:space="preserve">% of copy ceiling</w:t>
+            </w:r>
+          </w:p>
+        </w:tc>
+        <w:tc>
+          <w:tcPr>
+            <w:tcW w:w="977" w:type="dxa"/>
+            <w:shd w:val="clear" w:color="auto" w:fill="F2F2F2"/>
+          </w:tcPr>
+          <w:p>
+            <w:pPr/>
+            <w:r>
               <w:t xml:space="preserve">Real-time factor</w:t>
             </w:r>
           </w:p>
         </w:tc>
         <w:tc>
           <w:tcPr>
-            <w:tcW w:w="1158" w:type="dxa"/>
+            <w:tcW w:w="989" w:type="dxa"/>
             <w:shd w:val="clear" w:color="auto" w:fill="F2F2F2"/>
           </w:tcPr>
           <w:p>
@@ -3488,85 +3514,84 @@
       <w:tr>
         <w:tc>
           <w:tcPr>
-            <w:tcW w:w="1974" w:type="dxa"/>
-          </w:tcPr>
-          <w:p>
-            <w:pPr/>
-            <w:r>
-              <w:t xml:space="preserve">Serial</w:t>
-            </w:r>
-          </w:p>
-        </w:tc>
-        <w:tc>
-          <w:tcPr>
-            <w:tcW w:w="1856" w:type="dxa"/>
-          </w:tcPr>
-          <w:p>
-            <w:pPr/>
-            <w:r>
-              <w:rPr>
-                <w:i/>
-              </w:rPr>
-              <w:t xml:space="preserve">CPU model</w:t>
-            </w:r>
-          </w:p>
-        </w:tc>
-        <w:tc>
-          <w:tcPr>
-            <w:tcW w:w="825" w:type="dxa"/>
-          </w:tcPr>
-          <w:p>
-            <w:pPr/>
-            <w:r>
-              <w:rPr>
-                <w:i/>
-              </w:rPr>
+            <w:tcW w:w="1680" w:type="dxa"/>
+          </w:tcPr>
+          <w:p>
+            <w:pPr/>
+            <w:r>
+              <w:t xml:space="preserve">Serial C</w:t>
+            </w:r>
+          </w:p>
+        </w:tc>
+        <w:tc>
+          <w:tcPr>
+            <w:tcW w:w="1417" w:type="dxa"/>
+          </w:tcPr>
+          <w:p>
+            <w:pPr/>
+            <w:r>
+              <w:t xml:space="preserve">1 core</w:t>
+            </w:r>
+          </w:p>
+        </w:tc>
+        <w:tc>
+          <w:tcPr>
+            <w:tcW w:w="998" w:type="dxa"/>
+          </w:tcPr>
+          <w:p>
+            <w:pPr/>
+            <w:r>
+              <w:t xml:space="preserve">26.58</w:t>
+            </w:r>
+          </w:p>
+        </w:tc>
+        <w:tc>
+          <w:tcPr>
+            <w:tcW w:w="1170" w:type="dxa"/>
+          </w:tcPr>
+          <w:p>
+            <w:pPr/>
+            <w:r>
+              <w:t xml:space="preserve">0.60</w:t>
+            </w:r>
+          </w:p>
+        </w:tc>
+        <w:tc>
+          <w:tcPr>
+            <w:tcW w:w="1180" w:type="dxa"/>
+          </w:tcPr>
+          <w:p>
+            <w:pPr/>
+            <w:r>
+              <w:t xml:space="preserve">4.8</w:t>
+            </w:r>
+          </w:p>
+        </w:tc>
+        <w:tc>
+          <w:tcPr>
+            <w:tcW w:w="949" w:type="dxa"/>
+          </w:tcPr>
+          <w:p>
+            <w:pPr/>
+            <w:r>
               <w:t xml:space="preserve">–</w:t>
             </w:r>
           </w:p>
         </w:tc>
         <w:tc>
           <w:tcPr>
-            <w:tcW w:w="1266" w:type="dxa"/>
-          </w:tcPr>
-          <w:p>
-            <w:pPr/>
-            <w:r>
-              <w:rPr>
-                <w:i/>
-              </w:rPr>
-              <w:t xml:space="preserve">–</w:t>
-            </w:r>
-          </w:p>
-        </w:tc>
-        <w:tc>
-          <w:tcPr>
-            <w:tcW w:w="1312" w:type="dxa"/>
-          </w:tcPr>
-          <w:p>
-            <w:pPr/>
-            <w:r>
-              <w:t xml:space="preserve">–</w:t>
-            </w:r>
-          </w:p>
-        </w:tc>
-        <w:tc>
-          <w:tcPr>
-            <w:tcW w:w="968" w:type="dxa"/>
-          </w:tcPr>
-          <w:p>
-            <w:pPr/>
-            <w:r>
-              <w:rPr>
-                <w:i/>
-              </w:rPr>
-              <w:t xml:space="preserve">–</w:t>
-            </w:r>
-          </w:p>
-        </w:tc>
-        <w:tc>
-          <w:tcPr>
-            <w:tcW w:w="1158" w:type="dxa"/>
+            <w:tcW w:w="977" w:type="dxa"/>
+          </w:tcPr>
+          <w:p>
+            <w:pPr/>
+            <w:r>
+              <w:t xml:space="preserve">0.77</w:t>
+            </w:r>
+          </w:p>
+        </w:tc>
+        <w:tc>
+          <w:tcPr>
+            <w:tcW w:w="989" w:type="dxa"/>
           </w:tcPr>
           <w:p>
             <w:pPr/>
@@ -3579,7 +3604,7 @@
       <w:tr>
         <w:tc>
           <w:tcPr>
-            <w:tcW w:w="1974" w:type="dxa"/>
+            <w:tcW w:w="1680" w:type="dxa"/>
           </w:tcPr>
           <w:p>
             <w:pPr/>
@@ -3590,82 +3615,78 @@
         </w:tc>
         <w:tc>
           <w:tcPr>
-            <w:tcW w:w="1856" w:type="dxa"/>
-          </w:tcPr>
-          <w:p>
-            <w:pPr/>
-            <w:r>
-              <w:rPr>
-                <w:i/>
-              </w:rPr>
-              <w:t xml:space="preserve">CPU, N threads</w:t>
-            </w:r>
-          </w:p>
-        </w:tc>
-        <w:tc>
-          <w:tcPr>
-            <w:tcW w:w="825" w:type="dxa"/>
-          </w:tcPr>
-          <w:p>
-            <w:pPr/>
-            <w:r>
-              <w:rPr>
-                <w:i/>
-              </w:rPr>
+            <w:tcW w:w="1417" w:type="dxa"/>
+          </w:tcPr>
+          <w:p>
+            <w:pPr/>
+            <w:r>
+              <w:t xml:space="preserve">16 threads</w:t>
+            </w:r>
+          </w:p>
+        </w:tc>
+        <w:tc>
+          <w:tcPr>
+            <w:tcW w:w="998" w:type="dxa"/>
+          </w:tcPr>
+          <w:p>
+            <w:pPr/>
+            <w:r>
+              <w:t xml:space="preserve">15.43</w:t>
+            </w:r>
+          </w:p>
+        </w:tc>
+        <w:tc>
+          <w:tcPr>
+            <w:tcW w:w="1170" w:type="dxa"/>
+          </w:tcPr>
+          <w:p>
+            <w:pPr/>
+            <w:r>
+              <w:t xml:space="preserve">1.04</w:t>
+            </w:r>
+          </w:p>
+        </w:tc>
+        <w:tc>
+          <w:tcPr>
+            <w:tcW w:w="1180" w:type="dxa"/>
+          </w:tcPr>
+          <w:p>
+            <w:pPr/>
+            <w:r>
+              <w:t xml:space="preserve">8.3</w:t>
+            </w:r>
+          </w:p>
+        </w:tc>
+        <w:tc>
+          <w:tcPr>
+            <w:tcW w:w="949" w:type="dxa"/>
+          </w:tcPr>
+          <w:p>
+            <w:pPr/>
+            <w:r>
               <w:t xml:space="preserve">–</w:t>
             </w:r>
           </w:p>
         </w:tc>
         <w:tc>
           <w:tcPr>
-            <w:tcW w:w="1266" w:type="dxa"/>
-          </w:tcPr>
-          <w:p>
-            <w:pPr/>
-            <w:r>
-              <w:rPr>
-                <w:i/>
-              </w:rPr>
-              <w:t xml:space="preserve">–</w:t>
-            </w:r>
-          </w:p>
-        </w:tc>
-        <w:tc>
-          <w:tcPr>
-            <w:tcW w:w="1312" w:type="dxa"/>
-          </w:tcPr>
-          <w:p>
-            <w:pPr/>
-            <w:r>
-              <w:t xml:space="preserve">–</w:t>
-            </w:r>
-          </w:p>
-        </w:tc>
-        <w:tc>
-          <w:tcPr>
-            <w:tcW w:w="968" w:type="dxa"/>
-          </w:tcPr>
-          <w:p>
-            <w:pPr/>
-            <w:r>
-              <w:rPr>
-                <w:i/>
-              </w:rPr>
-              <w:t xml:space="preserve">–</w:t>
-            </w:r>
-          </w:p>
-        </w:tc>
-        <w:tc>
-          <w:tcPr>
-            <w:tcW w:w="1158" w:type="dxa"/>
-          </w:tcPr>
-          <w:p>
-            <w:pPr/>
-            <w:r>
-              <w:rPr>
-                <w:i/>
-              </w:rPr>
-              <w:t xml:space="preserve">–</w:t>
+            <w:tcW w:w="977" w:type="dxa"/>
+          </w:tcPr>
+          <w:p>
+            <w:pPr/>
+            <w:r>
+              <w:t xml:space="preserve">1.33</w:t>
+            </w:r>
+          </w:p>
+        </w:tc>
+        <w:tc>
+          <w:tcPr>
+            <w:tcW w:w="989" w:type="dxa"/>
+          </w:tcPr>
+          <w:p>
+            <w:pPr/>
+            <w:r>
+              <w:t xml:space="preserve">1.7</w:t>
             </w:r>
           </w:p>
         </w:tc>
@@ -3673,7 +3694,7 @@
       <w:tr>
         <w:tc>
           <w:tcPr>
-            <w:tcW w:w="1974" w:type="dxa"/>
+            <w:tcW w:w="1680" w:type="dxa"/>
           </w:tcPr>
           <w:p>
             <w:pPr/>
@@ -3684,82 +3705,78 @@
         </w:tc>
         <w:tc>
           <w:tcPr>
-            <w:tcW w:w="1856" w:type="dxa"/>
-          </w:tcPr>
-          <w:p>
-            <w:pPr/>
-            <w:r>
-              <w:rPr>
-                <w:i/>
-              </w:rPr>
-              <w:t xml:space="preserve">CPU, P ranks</w:t>
-            </w:r>
-          </w:p>
-        </w:tc>
-        <w:tc>
-          <w:tcPr>
-            <w:tcW w:w="825" w:type="dxa"/>
-          </w:tcPr>
-          <w:p>
-            <w:pPr/>
-            <w:r>
-              <w:rPr>
-                <w:i/>
-              </w:rPr>
+            <w:tcW w:w="1417" w:type="dxa"/>
+          </w:tcPr>
+          <w:p>
+            <w:pPr/>
+            <w:r>
+              <w:t xml:space="preserve">16 ranks</w:t>
+            </w:r>
+          </w:p>
+        </w:tc>
+        <w:tc>
+          <w:tcPr>
+            <w:tcW w:w="998" w:type="dxa"/>
+          </w:tcPr>
+          <w:p>
+            <w:pPr/>
+            <w:r>
+              <w:t xml:space="preserve">7.55</w:t>
+            </w:r>
+          </w:p>
+        </w:tc>
+        <w:tc>
+          <w:tcPr>
+            <w:tcW w:w="1170" w:type="dxa"/>
+          </w:tcPr>
+          <w:p>
+            <w:pPr/>
+            <w:r>
+              <w:t xml:space="preserve">2.12</w:t>
+            </w:r>
+          </w:p>
+        </w:tc>
+        <w:tc>
+          <w:tcPr>
+            <w:tcW w:w="1180" w:type="dxa"/>
+          </w:tcPr>
+          <w:p>
+            <w:pPr/>
+            <w:r>
+              <w:t xml:space="preserve">16.9</w:t>
+            </w:r>
+          </w:p>
+        </w:tc>
+        <w:tc>
+          <w:tcPr>
+            <w:tcW w:w="949" w:type="dxa"/>
+          </w:tcPr>
+          <w:p>
+            <w:pPr/>
+            <w:r>
               <w:t xml:space="preserve">–</w:t>
             </w:r>
           </w:p>
         </w:tc>
         <w:tc>
           <w:tcPr>
-            <w:tcW w:w="1266" w:type="dxa"/>
-          </w:tcPr>
-          <w:p>
-            <w:pPr/>
-            <w:r>
-              <w:rPr>
-                <w:i/>
-              </w:rPr>
-              <w:t xml:space="preserve">–</w:t>
-            </w:r>
-          </w:p>
-        </w:tc>
-        <w:tc>
-          <w:tcPr>
-            <w:tcW w:w="1312" w:type="dxa"/>
-          </w:tcPr>
-          <w:p>
-            <w:pPr/>
-            <w:r>
-              <w:t xml:space="preserve">–</w:t>
-            </w:r>
-          </w:p>
-        </w:tc>
-        <w:tc>
-          <w:tcPr>
-            <w:tcW w:w="968" w:type="dxa"/>
-          </w:tcPr>
-          <w:p>
-            <w:pPr/>
-            <w:r>
-              <w:rPr>
-                <w:i/>
-              </w:rPr>
-              <w:t xml:space="preserve">–</w:t>
-            </w:r>
-          </w:p>
-        </w:tc>
-        <w:tc>
-          <w:tcPr>
-            <w:tcW w:w="1158" w:type="dxa"/>
-          </w:tcPr>
-          <w:p>
-            <w:pPr/>
-            <w:r>
-              <w:rPr>
-                <w:i/>
-              </w:rPr>
-              <w:t xml:space="preserve">–</w:t>
+            <w:tcW w:w="977" w:type="dxa"/>
+          </w:tcPr>
+          <w:p>
+            <w:pPr/>
+            <w:r>
+              <w:t xml:space="preserve">2.71</w:t>
+            </w:r>
+          </w:p>
+        </w:tc>
+        <w:tc>
+          <w:tcPr>
+            <w:tcW w:w="989" w:type="dxa"/>
+          </w:tcPr>
+          <w:p>
+            <w:pPr/>
+            <w:r>
+              <w:t xml:space="preserve">3.5</w:t>
             </w:r>
           </w:p>
         </w:tc>
@@ -3767,7 +3784,7 @@
       <w:tr>
         <w:tc>
           <w:tcPr>
-            <w:tcW w:w="1974" w:type="dxa"/>
+            <w:tcW w:w="1680" w:type="dxa"/>
           </w:tcPr>
           <w:p>
             <w:pPr/>
@@ -3778,85 +3795,78 @@
         </w:tc>
         <w:tc>
           <w:tcPr>
-            <w:tcW w:w="1856" w:type="dxa"/>
-          </w:tcPr>
-          <w:p>
-            <w:pPr/>
-            <w:r>
-              <w:rPr>
-                <w:i/>
-              </w:rPr>
-              <w:t xml:space="preserve">GPU model</w:t>
-            </w:r>
-          </w:p>
-        </w:tc>
-        <w:tc>
-          <w:tcPr>
-            <w:tcW w:w="825" w:type="dxa"/>
-          </w:tcPr>
-          <w:p>
-            <w:pPr/>
-            <w:r>
-              <w:rPr>
-                <w:i/>
-              </w:rPr>
-              <w:t xml:space="preserve">–</w:t>
-            </w:r>
-          </w:p>
-        </w:tc>
-        <w:tc>
-          <w:tcPr>
-            <w:tcW w:w="1266" w:type="dxa"/>
-          </w:tcPr>
-          <w:p>
-            <w:pPr/>
-            <w:r>
-              <w:rPr>
-                <w:i/>
-              </w:rPr>
-              <w:t xml:space="preserve">–</w:t>
-            </w:r>
-          </w:p>
-        </w:tc>
-        <w:tc>
-          <w:tcPr>
-            <w:tcW w:w="1312" w:type="dxa"/>
-          </w:tcPr>
-          <w:p>
-            <w:pPr/>
-            <w:r>
-              <w:rPr>
-                <w:i/>
-              </w:rPr>
-              <w:t xml:space="preserve">–</w:t>
-            </w:r>
-          </w:p>
-        </w:tc>
-        <w:tc>
-          <w:tcPr>
-            <w:tcW w:w="968" w:type="dxa"/>
-          </w:tcPr>
-          <w:p>
-            <w:pPr/>
-            <w:r>
-              <w:rPr>
-                <w:i/>
-              </w:rPr>
-              <w:t xml:space="preserve">–</w:t>
-            </w:r>
-          </w:p>
-        </w:tc>
-        <w:tc>
-          <w:tcPr>
-            <w:tcW w:w="1158" w:type="dxa"/>
-          </w:tcPr>
-          <w:p>
-            <w:pPr/>
-            <w:r>
-              <w:rPr>
-                <w:i/>
-              </w:rPr>
-              <w:t xml:space="preserve">–</w:t>
+            <w:tcW w:w="1417" w:type="dxa"/>
+          </w:tcPr>
+          <w:p>
+            <w:pPr/>
+            <w:r>
+              <w:t xml:space="preserve">RTX 3050</w:t>
+            </w:r>
+          </w:p>
+        </w:tc>
+        <w:tc>
+          <w:tcPr>
+            <w:tcW w:w="998" w:type="dxa"/>
+          </w:tcPr>
+          <w:p>
+            <w:pPr/>
+            <w:r>
+              <w:t xml:space="preserve">1.218</w:t>
+            </w:r>
+          </w:p>
+        </w:tc>
+        <w:tc>
+          <w:tcPr>
+            <w:tcW w:w="1170" w:type="dxa"/>
+          </w:tcPr>
+          <w:p>
+            <w:pPr/>
+            <w:r>
+              <w:t xml:space="preserve">13.1</w:t>
+            </w:r>
+          </w:p>
+        </w:tc>
+        <w:tc>
+          <w:tcPr>
+            <w:tcW w:w="1180" w:type="dxa"/>
+          </w:tcPr>
+          <w:p>
+            <w:pPr/>
+            <w:r>
+              <w:t xml:space="preserve">105.1</w:t>
+            </w:r>
+          </w:p>
+        </w:tc>
+        <w:tc>
+          <w:tcPr>
+            <w:tcW w:w="949" w:type="dxa"/>
+          </w:tcPr>
+          <w:p>
+            <w:pPr/>
+            <w:r>
+              <w:t xml:space="preserve">102%</w:t>
+            </w:r>
+          </w:p>
+        </w:tc>
+        <w:tc>
+          <w:tcPr>
+            <w:tcW w:w="977" w:type="dxa"/>
+          </w:tcPr>
+          <w:p>
+            <w:pPr/>
+            <w:r>
+              <w:t xml:space="preserve">16.8</w:t>
+            </w:r>
+          </w:p>
+        </w:tc>
+        <w:tc>
+          <w:tcPr>
+            <w:tcW w:w="989" w:type="dxa"/>
+          </w:tcPr>
+          <w:p>
+            <w:pPr/>
+            <w:r>
+              <w:t xml:space="preserve">21.8</w:t>
             </w:r>
           </w:p>
         </w:tc>
@@ -3864,7 +3874,7 @@
       <w:tr>
         <w:tc>
           <w:tcPr>
-            <w:tcW w:w="1974" w:type="dxa"/>
+            <w:tcW w:w="1680" w:type="dxa"/>
           </w:tcPr>
           <w:p>
             <w:pPr/>
@@ -3875,85 +3885,78 @@
         </w:tc>
         <w:tc>
           <w:tcPr>
-            <w:tcW w:w="1856" w:type="dxa"/>
-          </w:tcPr>
-          <w:p>
-            <w:pPr/>
-            <w:r>
-              <w:rPr>
-                <w:i/>
-              </w:rPr>
-              <w:t xml:space="preserve">GPU model</w:t>
-            </w:r>
-          </w:p>
-        </w:tc>
-        <w:tc>
-          <w:tcPr>
-            <w:tcW w:w="825" w:type="dxa"/>
-          </w:tcPr>
-          <w:p>
-            <w:pPr/>
-            <w:r>
-              <w:rPr>
-                <w:i/>
-              </w:rPr>
-              <w:t xml:space="preserve">–</w:t>
-            </w:r>
-          </w:p>
-        </w:tc>
-        <w:tc>
-          <w:tcPr>
-            <w:tcW w:w="1266" w:type="dxa"/>
-          </w:tcPr>
-          <w:p>
-            <w:pPr/>
-            <w:r>
-              <w:rPr>
-                <w:i/>
-              </w:rPr>
-              <w:t xml:space="preserve">–</w:t>
-            </w:r>
-          </w:p>
-        </w:tc>
-        <w:tc>
-          <w:tcPr>
-            <w:tcW w:w="1312" w:type="dxa"/>
-          </w:tcPr>
-          <w:p>
-            <w:pPr/>
-            <w:r>
-              <w:rPr>
-                <w:i/>
-              </w:rPr>
-              <w:t xml:space="preserve">–</w:t>
-            </w:r>
-          </w:p>
-        </w:tc>
-        <w:tc>
-          <w:tcPr>
-            <w:tcW w:w="968" w:type="dxa"/>
-          </w:tcPr>
-          <w:p>
-            <w:pPr/>
-            <w:r>
-              <w:rPr>
-                <w:i/>
-              </w:rPr>
-              <w:t xml:space="preserve">–</w:t>
-            </w:r>
-          </w:p>
-        </w:tc>
-        <w:tc>
-          <w:tcPr>
-            <w:tcW w:w="1158" w:type="dxa"/>
-          </w:tcPr>
-          <w:p>
-            <w:pPr/>
-            <w:r>
-              <w:rPr>
-                <w:i/>
-              </w:rPr>
-              <w:t xml:space="preserve">–</w:t>
+            <w:tcW w:w="1417" w:type="dxa"/>
+          </w:tcPr>
+          <w:p>
+            <w:pPr/>
+            <w:r>
+              <w:t xml:space="preserve">RTX 3050</w:t>
+            </w:r>
+          </w:p>
+        </w:tc>
+        <w:tc>
+          <w:tcPr>
+            <w:tcW w:w="998" w:type="dxa"/>
+          </w:tcPr>
+          <w:p>
+            <w:pPr/>
+            <w:r>
+              <w:t xml:space="preserve">1.223</w:t>
+            </w:r>
+          </w:p>
+        </w:tc>
+        <w:tc>
+          <w:tcPr>
+            <w:tcW w:w="1170" w:type="dxa"/>
+          </w:tcPr>
+          <w:p>
+            <w:pPr/>
+            <w:r>
+              <w:t xml:space="preserve">13.1</w:t>
+            </w:r>
+          </w:p>
+        </w:tc>
+        <w:tc>
+          <w:tcPr>
+            <w:tcW w:w="1180" w:type="dxa"/>
+          </w:tcPr>
+          <w:p>
+            <w:pPr/>
+            <w:r>
+              <w:t xml:space="preserve">104.6</w:t>
+            </w:r>
+          </w:p>
+        </w:tc>
+        <w:tc>
+          <w:tcPr>
+            <w:tcW w:w="949" w:type="dxa"/>
+          </w:tcPr>
+          <w:p>
+            <w:pPr/>
+            <w:r>
+              <w:t xml:space="preserve">102%</w:t>
+            </w:r>
+          </w:p>
+        </w:tc>
+        <w:tc>
+          <w:tcPr>
+            <w:tcW w:w="977" w:type="dxa"/>
+          </w:tcPr>
+          <w:p>
+            <w:pPr/>
+            <w:r>
+              <w:t xml:space="preserve">16.7</w:t>
+            </w:r>
+          </w:p>
+        </w:tc>
+        <w:tc>
+          <w:tcPr>
+            <w:tcW w:w="989" w:type="dxa"/>
+          </w:tcPr>
+          <w:p>
+            <w:pPr/>
+            <w:r>
+              <w:t xml:space="preserve">21.7</w:t>
             </w:r>
           </w:p>
         </w:tc>
@@ -3961,7 +3964,7 @@
       <w:tr>
         <w:tc>
           <w:tcPr>
-            <w:tcW w:w="1974" w:type="dxa"/>
+            <w:tcW w:w="1680" w:type="dxa"/>
           </w:tcPr>
           <w:p>
             <w:pPr/>
@@ -3972,85 +3975,78 @@
         </w:tc>
         <w:tc>
           <w:tcPr>
-            <w:tcW w:w="1856" w:type="dxa"/>
-          </w:tcPr>
-          <w:p>
-            <w:pPr/>
-            <w:r>
-              <w:rPr>
-                <w:i/>
-              </w:rPr>
-              <w:t xml:space="preserve">GPU model</w:t>
-            </w:r>
-          </w:p>
-        </w:tc>
-        <w:tc>
-          <w:tcPr>
-            <w:tcW w:w="825" w:type="dxa"/>
-          </w:tcPr>
-          <w:p>
-            <w:pPr/>
-            <w:r>
-              <w:rPr>
-                <w:i/>
-              </w:rPr>
-              <w:t xml:space="preserve">–</w:t>
-            </w:r>
-          </w:p>
-        </w:tc>
-        <w:tc>
-          <w:tcPr>
-            <w:tcW w:w="1266" w:type="dxa"/>
-          </w:tcPr>
-          <w:p>
-            <w:pPr/>
-            <w:r>
-              <w:rPr>
-                <w:i/>
-              </w:rPr>
-              <w:t xml:space="preserve">–</w:t>
-            </w:r>
-          </w:p>
-        </w:tc>
-        <w:tc>
-          <w:tcPr>
-            <w:tcW w:w="1312" w:type="dxa"/>
-          </w:tcPr>
-          <w:p>
-            <w:pPr/>
-            <w:r>
-              <w:rPr>
-                <w:i/>
-              </w:rPr>
-              <w:t xml:space="preserve">–</w:t>
-            </w:r>
-          </w:p>
-        </w:tc>
-        <w:tc>
-          <w:tcPr>
-            <w:tcW w:w="968" w:type="dxa"/>
-          </w:tcPr>
-          <w:p>
-            <w:pPr/>
-            <w:r>
-              <w:rPr>
-                <w:i/>
-              </w:rPr>
-              <w:t xml:space="preserve">–</w:t>
-            </w:r>
-          </w:p>
-        </w:tc>
-        <w:tc>
-          <w:tcPr>
-            <w:tcW w:w="1158" w:type="dxa"/>
-          </w:tcPr>
-          <w:p>
-            <w:pPr/>
-            <w:r>
-              <w:rPr>
-                <w:i/>
-              </w:rPr>
-              <w:t xml:space="preserve">–</w:t>
+            <w:tcW w:w="1417" w:type="dxa"/>
+          </w:tcPr>
+          <w:p>
+            <w:pPr/>
+            <w:r>
+              <w:t xml:space="preserve">RTX 3050</w:t>
+            </w:r>
+          </w:p>
+        </w:tc>
+        <w:tc>
+          <w:tcPr>
+            <w:tcW w:w="998" w:type="dxa"/>
+          </w:tcPr>
+          <w:p>
+            <w:pPr/>
+            <w:r>
+              <w:t xml:space="preserve">1.334</w:t>
+            </w:r>
+          </w:p>
+        </w:tc>
+        <w:tc>
+          <w:tcPr>
+            <w:tcW w:w="1170" w:type="dxa"/>
+          </w:tcPr>
+          <w:p>
+            <w:pPr/>
+            <w:r>
+              <w:t xml:space="preserve">12.0</w:t>
+            </w:r>
+          </w:p>
+        </w:tc>
+        <w:tc>
+          <w:tcPr>
+            <w:tcW w:w="1180" w:type="dxa"/>
+          </w:tcPr>
+          <w:p>
+            <w:pPr/>
+            <w:r>
+              <w:t xml:space="preserve">96.0</w:t>
+            </w:r>
+          </w:p>
+        </w:tc>
+        <w:tc>
+          <w:tcPr>
+            <w:tcW w:w="949" w:type="dxa"/>
+          </w:tcPr>
+          <w:p>
+            <w:pPr/>
+            <w:r>
+              <w:t xml:space="preserve">94%</w:t>
+            </w:r>
+          </w:p>
+        </w:tc>
+        <w:tc>
+          <w:tcPr>
+            <w:tcW w:w="977" w:type="dxa"/>
+          </w:tcPr>
+          <w:p>
+            <w:pPr/>
+            <w:r>
+              <w:t xml:space="preserve">15.3</w:t>
+            </w:r>
+          </w:p>
+        </w:tc>
+        <w:tc>
+          <w:tcPr>
+            <w:tcW w:w="989" w:type="dxa"/>
+          </w:tcPr>
+          <w:p>
+            <w:pPr/>
+            <w:r>
+              <w:t xml:space="preserve">19.9</w:t>
             </w:r>
           </w:p>
         </w:tc>
@@ -4059,7 +4055,247 @@
     <w:p>
       <w:pPr/>
       <w:r>
-        <w:t xml:space="preserve">The benchmark also produces three figures to insert here: OpenMP strong scaling, MPI compute versus exposed communication time, and achieved GPU bandwidth across grid sizes. Discuss the measured kernel ranking against prediction 2 of Section VII: whichever way it falls, the bandwidth model should explain it.</w:t>
+        <w:t xml:space="preserve">A single CPU core simulates the release more slowly than it happens (0.77× real time); the GPU runs 16.8× ahead of it (Fig. 3).</w:t>
+      </w:r>
+    </w:p>
+    <w:p>
+      <w:pPr/>
+      <w:r>
+        <w:drawing>
+          <wp:inline distT="0" distB="0" distL="0" distR="0">
+            <wp:extent cx="5486400" cy="3135085"/>
+            <wp:docPr id="3" name="image3" descr="Throughput by implementation on the 4000 × 4000 grid"/>
+            <a:graphic xmlns:a="http://schemas.openxmlformats.org/drawingml/2006/main">
+              <a:graphicData uri="http://schemas.openxmlformats.org/drawingml/2006/picture">
+                <pic:pic xmlns:pic="http://schemas.openxmlformats.org/drawingml/2006/picture">
+                  <pic:nvPicPr>
+                    <pic:cNvPr id="3" name="image3" descr="Throughput by implementation on the 4000 × 4000 grid"/>
+                    <pic:cNvPicPr/>
+                  </pic:nvPicPr>
+                  <pic:blipFill>
+                    <a:blip r:embed="rId5"/>
+                    <a:stretch>
+                      <a:fillRect/>
+                    </a:stretch>
+                  </pic:blipFill>
+                  <pic:spPr>
+                    <a:xfrm>
+                      <a:off x="0" y="0"/>
+                      <a:ext cx="5486400" cy="3135085"/>
+                    </a:xfrm>
+                    <a:prstGeom prst="rect">
+                      <a:avLst/>
+                    </a:prstGeom>
+                  </pic:spPr>
+                </pic:pic>
+              </a:graphicData>
+            </a:graphic>
+          </wp:inline>
+        </w:drawing>
+      </w:r>
+    </w:p>
+    <w:p>
+      <w:pPr/>
+      <w:r>
+        <w:t xml:space="preserve">Fig. 3. Throughput by implementation on the 4000 × 4000 grid (log scale), labelled with each version's real-time factor.</w:t>
+      </w:r>
+    </w:p>
+    <w:p>
+      <w:pPr/>
+      <w:r>
+        <w:rPr>
+          <w:b/>
+        </w:rPr>
+        <w:t xml:space="preserve">GPU kernels.</w:t>
+      </w:r>
+      <w:r>
+        <w:t xml:space="preserve"> The GPU is 21.8× faster than serial C and 6.2× faster than the best CPU version, MPI on 16 ranks. Prediction 2 is confirmed: the shared-memory tiled kernel is no faster than the naive kernel (1.223 versus 1.218 ms), because the neighbour re-reads it eliminates were already served by the L1 and L2 caches. The thread-coarsened kernel, which Section VII expected to gain most, was 9% slower. We have not profiled it. Our hypothesis is that its 8-iteration loop has a bound computed at run time, so the compiler cannot unroll it, and each thread waits for one row's loads before issuing the next; Nsight Compute profiling would test this.</w:t>
+      </w:r>
+    </w:p>
+    <w:p>
+      <w:pPr/>
+      <w:r>
+        <w:rPr>
+          <w:b/>
+        </w:rPr>
+        <w:t xml:space="preserve">Memory bandwidth.</w:t>
+      </w:r>
+      <w:r>
+        <w:t xml:space="preserve"> As a practical ceiling, the benchmark times a device-to-device copy of the 4000 × 4000 field, which moves exactly the stencil's minimum traffic. The copy reaches 102.8 GB/s. The naive and tiled kernels match it (102% of the copy rate; a library copy is not perfectly efficient either) and the coarsened kernel reaches 94%. The stencil therefore runs at the practical memory-bandwidth limit of this laptop: further tuning of the kernels cannot make it faster, and only moving less data can (Section XI). The CUDA driver reports a theoretical peak of 112 GB/s for this laptop's memory configuration, of which the copy achieves 92%, a typical efficiency for a device-to-device copy. Notebookcheck lists 192 GB/s for this GPU model in its common configuration [17], so this laptop's memory system is slower than that configuration.</w:t>
+      </w:r>
+    </w:p>
+    <w:p>
+      <w:pPr/>
+      <w:r>
+        <w:rPr>
+          <w:b/>
+        </w:rPr>
+        <w:t xml:space="preserve">Grid size.</w:t>
+      </w:r>
+      <w:r>
+        <w:t xml:space="preserve"> Below 512 × 512, a step does too little work to occupy the GPU: at 256 × 256 the effective bandwidth is only 11–35 GB/s and launch overhead dominates. From 1024 × 1024 upward, all three kernels sustain 94–105 GB/s (Fig. 6), so the time per cell is constant and run time grows in proportion to the number of cells.</w:t>
+      </w:r>
+    </w:p>
+    <w:p>
+      <w:pPr/>
+      <w:r>
+        <w:drawing>
+          <wp:inline distT="0" distB="0" distL="0" distR="0">
+            <wp:extent cx="5486400" cy="3657600"/>
+            <wp:docPr id="4" name="image4" descr="GPU effective bandwidth across grid sizes"/>
+            <a:graphic xmlns:a="http://schemas.openxmlformats.org/drawingml/2006/main">
+              <a:graphicData uri="http://schemas.openxmlformats.org/drawingml/2006/picture">
+                <pic:pic xmlns:pic="http://schemas.openxmlformats.org/drawingml/2006/picture">
+                  <pic:nvPicPr>
+                    <pic:cNvPr id="4" name="image4" descr="GPU effective bandwidth across grid sizes"/>
+                    <pic:cNvPicPr/>
+                  </pic:nvPicPr>
+                  <pic:blipFill>
+                    <a:blip r:embed="rId6"/>
+                    <a:stretch>
+                      <a:fillRect/>
+                    </a:stretch>
+                  </pic:blipFill>
+                  <pic:spPr>
+                    <a:xfrm>
+                      <a:off x="0" y="0"/>
+                      <a:ext cx="5486400" cy="3657600"/>
+                    </a:xfrm>
+                    <a:prstGeom prst="rect">
+                      <a:avLst/>
+                    </a:prstGeom>
+                  </pic:spPr>
+                </pic:pic>
+              </a:graphicData>
+            </a:graphic>
+          </wp:inline>
+        </w:drawing>
+      </w:r>
+    </w:p>
+    <w:p>
+      <w:pPr/>
+      <w:r>
+        <w:t xml:space="preserve">Fig. 6. Effective bandwidth of the three kernels against grid size. The dashed line is the measured device-to-device copy rate on the largest grid, the practical ceiling.</w:t>
+      </w:r>
+    </w:p>
+    <w:p>
+      <w:pPr/>
+      <w:r>
+        <w:rPr>
+          <w:b/>
+        </w:rPr>
+        <w:t xml:space="preserve">OpenMP.</w:t>
+      </w:r>
+      <w:r>
+        <w:t xml:space="preserve"> Strong scaling peaks early (Fig. 4): 1.5× at 2 threads, 1.9× at 4, 2.2× at 8, and back down to 1.7× at 16. Prediction 3 expected flattening once memory bandwidth saturates, but at 8–12 GB/s of effective bandwidth the plateau sits well below what the laptop's memory system can deliver, so bandwidth alone does not explain it. Two likely causes: the i5-13500H mixes fast performance cores with slower efficiency cores, and equal-sized row blocks make every step wait for the slowest core, which is worst at 16 threads, when every efficiency core and both hyper-threads of each performance core are busy; and WSL2 adds a virtualisation layer between threads and physical cores. Dynamic or core-weighted scheduling would test the first.</w:t>
+      </w:r>
+    </w:p>
+    <w:p>
+      <w:pPr/>
+      <w:r>
+        <w:drawing>
+          <wp:inline distT="0" distB="0" distL="0" distR="0">
+            <wp:extent cx="5486400" cy="4389120"/>
+            <wp:docPr id="5" name="image5" descr="OpenMP strong scaling"/>
+            <a:graphic xmlns:a="http://schemas.openxmlformats.org/drawingml/2006/main">
+              <a:graphicData uri="http://schemas.openxmlformats.org/drawingml/2006/picture">
+                <pic:pic xmlns:pic="http://schemas.openxmlformats.org/drawingml/2006/picture">
+                  <pic:nvPicPr>
+                    <pic:cNvPr id="5" name="image5" descr="OpenMP strong scaling"/>
+                    <pic:cNvPicPr/>
+                  </pic:nvPicPr>
+                  <pic:blipFill>
+                    <a:blip r:embed="rId7"/>
+                    <a:stretch>
+                      <a:fillRect/>
+                    </a:stretch>
+                  </pic:blipFill>
+                  <pic:spPr>
+                    <a:xfrm>
+                      <a:off x="0" y="0"/>
+                      <a:ext cx="5486400" cy="4389120"/>
+                    </a:xfrm>
+                    <a:prstGeom prst="rect">
+                      <a:avLst/>
+                    </a:prstGeom>
+                  </pic:spPr>
+                </pic:pic>
+              </a:graphicData>
+            </a:graphic>
+          </wp:inline>
+        </w:drawing>
+      </w:r>
+    </w:p>
+    <w:p>
+      <w:pPr/>
+      <w:r>
+        <w:t xml:space="preserve">Fig. 4. OpenMP strong scaling on the i5-13500H: speed-up over one thread against the ideal linear speed-up.</w:t>
+      </w:r>
+    </w:p>
+    <w:p>
+      <w:pPr/>
+      <w:r>
+        <w:rPr>
+          <w:b/>
+        </w:rPr>
+        <w:t xml:space="preserve">MPI.</w:t>
+      </w:r>
+      <w:r>
+        <w:t xml:space="preserve"> On this single machine, 16 MPI ranks with overlapped exchange were the fastest CPU version: 7.55 ms per step, about 2× faster than OpenMP on 16 threads (Fig. 5). Most of the gain arrives by 4 ranks (7.82 ms overlapped); from 4 to 16 ranks, computation per step shrinks only from 6.8 to 5.8 ms. Overlap paid off only when there was communication to hide. At 16 ranks it cut exposed communication from 6.3 to 3.9 ms and total time by 20%; at 2 ranks, with almost nothing to hide, splitting each step into five smaller sweeps made it 6% slower (14.3 versus 13.5 ms). Exposed communication at 16 ranks is far more than copying four block edges should take, so most of it is ranks waiting for slower neighbours, the same performance/efficiency-core imbalance seen with OpenMP. A plausible reason MPI beats OpenMP, which we have not tested: the 2D decomposition acts as cache blocking [6]. With 16 ranks, each rank's rows are 1,000 cells (4 kB) long instead of 4,000 (16 kB), so the three rows the stencil reads stay in the L1 cache.</w:t>
+      </w:r>
+    </w:p>
+    <w:p>
+      <w:pPr/>
+      <w:r>
+        <w:drawing>
+          <wp:inline distT="0" distB="0" distL="0" distR="0">
+            <wp:extent cx="5486400" cy="3135085"/>
+            <wp:docPr id="6" name="image6" descr="MPI compute versus exposed communication"/>
+            <a:graphic xmlns:a="http://schemas.openxmlformats.org/drawingml/2006/main">
+              <a:graphicData uri="http://schemas.openxmlformats.org/drawingml/2006/picture">
+                <pic:pic xmlns:pic="http://schemas.openxmlformats.org/drawingml/2006/picture">
+                  <pic:nvPicPr>
+                    <pic:cNvPr id="6" name="image6" descr="MPI compute versus exposed communication"/>
+                    <pic:cNvPicPr/>
+                  </pic:nvPicPr>
+                  <pic:blipFill>
+                    <a:blip r:embed="rId8"/>
+                    <a:stretch>
+                      <a:fillRect/>
+                    </a:stretch>
+                  </pic:blipFill>
+                  <pic:spPr>
+                    <a:xfrm>
+                      <a:off x="0" y="0"/>
+                      <a:ext cx="5486400" cy="3135085"/>
+                    </a:xfrm>
+                    <a:prstGeom prst="rect">
+                      <a:avLst/>
+                    </a:prstGeom>
+                  </pic:spPr>
+                </pic:pic>
+              </a:graphicData>
+            </a:graphic>
+          </wp:inline>
+        </w:drawing>
+      </w:r>
+    </w:p>
+    <w:p>
+      <w:pPr/>
+      <w:r>
+        <w:t xml:space="preserve">Fig. 5. MPI time per step for the slowest rank, split into computation and communication that overlap could not hide (ov = overlapped exchange).</w:t>
+      </w:r>
+    </w:p>
+    <w:p>
+      <w:pPr/>
+      <w:r>
+        <w:rPr>
+          <w:b/>
+        </w:rPr>
+        <w:t xml:space="preserve">Real-time objective.</w:t>
+      </w:r>
+      <w:r>
+        <w:t xml:space="preserve"> Objective 3 (at least 30× real time) is not met at the full 4000 × 4000 grid on this GPU: the fastest kernel reaches 16.8×. Because the time per cell is constant at large sizes, the real-time factor scales inversely with the cell count, and the objective is met for grids up to about 3,000 × 3,000 cells: 2048 × 2048 measured 63×. Coarser resolution helps twice over, through fewer cells and a longer stable time step: covering the same 4 km at 2 m resolution needs 2000 × 2000 cells with Δt = 0.075 s, which projects to about 240× real time.</w:t>
       </w:r>
     </w:p>
     <w:p>
@@ -4294,10 +4530,10 @@
         <w:rPr>
           <w:b/>
         </w:rPr>
-        <w:t xml:space="preserve">MPI on one machine.</w:t>
-      </w:r>
-      <w:r>
-        <w:t xml:space="preserve"> All MPI runs so far share one computer, so they demonstrate correctness and the split between computation and communication rather than speed-up across a cluster.</w:t>
+        <w:t xml:space="preserve">One test machine.</w:t>
+      </w:r>
+      <w:r>
+        <w:t xml:space="preserve"> All timings come from one laptop running Ubuntu under WSL2, and all MPI ranks share its CPU, so the MPI results show correctness and the split between computation and communication rather than speed-up across a cluster. Absolute numbers will differ on desktop or server hardware.</w:t>
       </w:r>
     </w:p>
     <w:p>
@@ -4335,13 +4571,7 @@
     <w:p>
       <w:pPr/>
       <w:r>
-        <w:t xml:space="preserve">We built a toxic gas dispersion simulator in six parallel versions on one shared stencil function. Every version reproduces the serial result bit for bit, and the serial code matches an analytic solution to 0.01% for diffusion, with first-order convergence under wind. The stability limit of the explicit scheme showed that iterations per second is the wrong target. The real-time factor is the right one, and at 1 m resolution 49 steps make one simulated second. A roofline analysis places the stencil firmly in the memory-bound region, predicts a real-time factor of about 30–40 on a T4-class GPU, and predicts that shared-memory tiling may gain little over cache-assisted naive loads. </w:t>
-      </w:r>
-      <w:r>
-        <w:rPr>
-          <w:i/>
-        </w:rPr>
-        <w:t xml:space="preserve">[Replace with the measured outcome after the GPU run.]</w:t>
+        <w:t xml:space="preserve">We built a toxic gas dispersion simulator in six parallel versions on one shared stencil function. Every version reproduces the serial result bit for bit, and the serial code matches an analytic solution to 0.01% for diffusion, with first-order convergence under wind. The stability limit of the explicit scheme showed that iterations per second is the wrong target. The real-time factor is the right one, and at 1 m resolution 49 steps make one simulated second. A roofline analysis places the stencil firmly in the memory-bound region, predicts a real-time factor of about 30–40 on a T4-class GPU, and predicts that shared-memory tiling may gain little over cache-assisted naive loads. Measurements on an RTX 3050 laptop GPU bore this out: the three kernels differ by under 10% at nearly the same effective bandwidth, tiling gained nothing, and coarsening lost 9%. The kernels run at the laptop's measured memory-bandwidth ceiling, so further gains must come from moving less data. The GPU ran 21.8× faster than serial C and reached 16.8× real time on the full 4000 × 4000 grid, short of the 30× objective, which is met at 2048 × 2048 (63×).</w:t>
       </w:r>
     </w:p>
     <w:p>
@@ -4360,6 +4590,30 @@
       </w:pPr>
       <w:r>
         <w:t xml:space="preserve">Temporal blocking: compute several time steps per pass over memory, which raises arithmetic intensity, the one change that moves a memory-bound stencil up the roofline.</w:t>
+      </w:r>
+    </w:p>
+    <w:p>
+      <w:pPr>
+        <w:pStyle w:val="ListParagraph"/>
+        <w:numPr>
+          <w:ilvl w:val="0"/>
+          <w:numId w:val="9"/>
+        </w:numPr>
+      </w:pPr>
+      <w:r>
+        <w:t xml:space="preserve">Profile the coarsened kernel with Nsight Compute, and try a compile-time loop bound so it can be unrolled.</w:t>
+      </w:r>
+    </w:p>
+    <w:p>
+      <w:pPr>
+        <w:pStyle w:val="ListParagraph"/>
+        <w:numPr>
+          <w:ilvl w:val="0"/>
+          <w:numId w:val="9"/>
+        </w:numPr>
+      </w:pPr>
+      <w:r>
+        <w:t xml:space="preserve">Core-aware load balancing for hybrid CPUs, so efficiency cores receive proportionally smaller blocks.</w:t>
       </w:r>
     </w:p>
     <w:p>
@@ -4792,6 +5046,12 @@
       <w:pPr/>
       <w:r>
         <w:t xml:space="preserve">[16] S. Gupta, A. Jaiswal, D. Amin, and M. Vishwanath, "gas-leak-pcap," GitHub repository, 2026. [Online]. Available: https://github.com/swastigupta8/gas-leak-pcap</w:t>
+      </w:r>
+    </w:p>
+    <w:p>
+      <w:pPr/>
+      <w:r>
+        <w:t xml:space="preserve">[17] Notebookcheck, "NVIDIA GeForce RTX 3050 4GB Laptop GPU." [Online]. Available: https://www.notebookcheck.org/NVIDIA-GeForce-RTX-3050-4GB-Laptop-GPU.782046.0.html (accessed Oct. 21, 2026).</w:t>
       </w:r>
     </w:p>
     <w:sectPr>

</xml_diff>